<commit_message>
Add Day 7 Fresher Runbook and update lab scripts with metadata
</commit_message>
<xml_diff>
--- a/Week_02/Day_07/Lab/Day_07_Lab_Guide.docx
+++ b/Week_02/Day_07/Lab/Day_07_Lab_Guide.docx
@@ -1497,7 +1497,7 @@
           <w:color w:val="141414"/>
           <w:sz w:val="19"/>
         </w:rPr>
-        <w:t>docker compose up -d spark-master spark-worker</w:t>
+        <w:t>docker compose -p day7_lab up -d spark-master spark-worker</w:t>
       </w:r>
     </w:p>
     <w:p>
@@ -2253,7 +2253,7 @@
           <w:color w:val="141414"/>
           <w:sz w:val="19"/>
         </w:rPr>
-        <w:t>docker compose --profile object-store run --rm mc</w:t>
+        <w:t>docker compose -p day7_lab --profile object-store run --rm mc</w:t>
       </w:r>
     </w:p>
     <w:p>
@@ -2272,7 +2272,7 @@
           <w:color w:val="141414"/>
           <w:sz w:val="19"/>
         </w:rPr>
-        <w:t>docker compose down</w:t>
+        <w:t>docker compose -p day7_lab down</w:t>
       </w:r>
     </w:p>
     <w:p>
@@ -4703,6 +4703,70 @@
         <w:t>How would you make Lab 11 safe to rerun in production?</w:t>
       </w:r>
     </w:p>
+    <w:p>
+      <w:pPr>
+        <w:pStyle w:val="Heading2"/>
+      </w:pPr>
+      <w:r>
+        <w:t>Day 7 Docker Compose project isolation</w:t>
+      </w:r>
+    </w:p>
+    <w:p>
+      <w:r>
+        <w:t>Day 7 uses the compose project name day7_lab so it does not mix with Day 6 containers when both lab folders are named Lab_Files. The run_lab.py wrapper already uses docker compose -p day7_lab.</w:t>
+      </w:r>
+    </w:p>
+    <w:p>
+      <w:r>
+        <w:t>If Spark reports file:/workspace/data/source/customers.csv is missing from an executor, recreate the containers with docker compose -p day7_lab down followed by docker compose -p day7_lab up -d spark-master spark-worker. The Spark master and worker must both mount the lab folder at /workspace.</w:t>
+      </w:r>
+    </w:p>
+    <w:p>
+      <w:pPr>
+        <w:pStyle w:val="Heading2"/>
+      </w:pPr>
+      <w:r>
+        <w:t>Fresher-friendly execution flow</w:t>
+      </w:r>
+    </w:p>
+    <w:p>
+      <w:r>
+        <w:t>Use python run_lab.py --list to see each lab number, learning layer, and title before running anything. Run labs one by one from 01 to 12, inspect the output folder after each run, and then continue.</w:t>
+      </w:r>
+    </w:p>
+    <w:p>
+      <w:r>
+        <w:t>The realistic Day 7 story is a retail order lakehouse: raw order events land in Bronze, Silver cleans and validates them, Gold produces revenue KPIs, and MinIO stores the lakehouse copy like an object store.</w:t>
+      </w:r>
+    </w:p>
+    <w:p>
+      <w:pPr>
+        <w:pStyle w:val="Heading2"/>
+      </w:pPr>
+      <w:r>
+        <w:t>Verified MinIO object-store copy</w:t>
+      </w:r>
+    </w:p>
+    <w:p>
+      <w:r>
+        <w:t>Start MinIO with docker compose -p day7_lab up -d minio. Then mirror the finished lakehouse with docker compose -p day7_lab --profile object-store run --rm mc.</w:t>
+      </w:r>
+    </w:p>
+    <w:p>
+      <w:r>
+        <w:t>Open MinIO Console at http://localhost:9001 with username minioadmin and password minioadmin. The bucket day7-lakehouse should contain bronze, silver, gold, quarantine, playground, and incremental paths.</w:t>
+      </w:r>
+    </w:p>
+    <w:p>
+      <w:r>
+        <w:t>The object-store mirror excludes local Spark .crc checksum side files so freshers see the actual lakehouse data files and _SUCCESS markers.</w:t>
+      </w:r>
+    </w:p>
+    <w:p>
+      <w:r>
+        <w:t>Standalone fresher runbook: Week_02/Day_07/Lab/Day_07_Fresher_Runbook.md</w:t>
+      </w:r>
+    </w:p>
     <w:sectPr>
       <w:pgSz w:w="12240" w:h="15840"/>
       <w:pgMar w:top="1440" w:right="1440" w:bottom="1440" w:left="1440" w:header="708" w:footer="708" w:gutter="0"/>

</xml_diff>

<commit_message>
Update Day 7 Fresher Runbook for Windows Command Prompt compatibility and modify lab execution instructions
</commit_message>
<xml_diff>
--- a/Week_02/Day_07/Lab/Day_07_Lab_Guide.docx
+++ b/Week_02/Day_07/Lab/Day_07_Lab_Guide.docx
@@ -4767,6 +4767,211 @@
         <w:t>Standalone fresher runbook: Week_02/Day_07/Lab/Day_07_Fresher_Runbook.md</w:t>
       </w:r>
     </w:p>
+    <w:p>
+      <w:pPr>
+        <w:pStyle w:val="Heading2"/>
+      </w:pPr>
+      <w:r>
+        <w:t>Windows Command Prompt execution</w:t>
+      </w:r>
+    </w:p>
+    <w:p>
+      <w:r>
+        <w:t>Use Windows Command Prompt (cmd.exe) for Day 7 lab commands.</w:t>
+      </w:r>
+    </w:p>
+    <w:p>
+      <w:pPr>
+        <w:pStyle w:val="IntenseQuote"/>
+      </w:pPr>
+      <w:r>
+        <w:t>cd Week_02\Day_07\Lab_Files</w:t>
+      </w:r>
+    </w:p>
+    <w:p>
+      <w:pPr>
+        <w:pStyle w:val="IntenseQuote"/>
+      </w:pPr>
+      <w:r>
+        <w:t>docker compose -p day7_lab down -v --remove-orphans</w:t>
+      </w:r>
+    </w:p>
+    <w:p>
+      <w:pPr>
+        <w:pStyle w:val="IntenseQuote"/>
+      </w:pPr>
+      <w:r>
+        <w:t>if exist data rmdir /s /q data</w:t>
+      </w:r>
+    </w:p>
+    <w:p>
+      <w:pPr>
+        <w:pStyle w:val="IntenseQuote"/>
+      </w:pPr>
+      <w:r>
+        <w:t>if exist lake rmdir /s /q lake</w:t>
+      </w:r>
+    </w:p>
+    <w:p>
+      <w:pPr>
+        <w:pStyle w:val="IntenseQuote"/>
+      </w:pPr>
+      <w:r>
+        <w:t>if exist output rmdir /s /q output</w:t>
+      </w:r>
+    </w:p>
+    <w:p>
+      <w:pPr>
+        <w:pStyle w:val="IntenseQuote"/>
+      </w:pPr>
+      <w:r>
+        <w:t>if exist state rmdir /s /q state</w:t>
+      </w:r>
+    </w:p>
+    <w:p>
+      <w:pPr>
+        <w:pStyle w:val="IntenseQuote"/>
+      </w:pPr>
+      <w:r>
+        <w:t>if exist run_logs rmdir /s /q run_logs</w:t>
+      </w:r>
+    </w:p>
+    <w:p>
+      <w:pPr>
+        <w:pStyle w:val="IntenseQuote"/>
+      </w:pPr>
+      <w:r>
+        <w:t>python generate_data.py</w:t>
+      </w:r>
+    </w:p>
+    <w:p>
+      <w:pPr>
+        <w:pStyle w:val="IntenseQuote"/>
+      </w:pPr>
+      <w:r>
+        <w:t>docker compose -p day7_lab up -d spark-master spark-worker</w:t>
+      </w:r>
+    </w:p>
+    <w:p>
+      <w:pPr>
+        <w:pStyle w:val="IntenseQuote"/>
+      </w:pPr>
+      <w:r>
+        <w:t>python run_lab.py --list</w:t>
+      </w:r>
+    </w:p>
+    <w:p>
+      <w:pPr>
+        <w:pStyle w:val="IntenseQuote"/>
+      </w:pPr>
+      <w:r>
+        <w:t>python run_lab.py 01</w:t>
+      </w:r>
+    </w:p>
+    <w:p>
+      <w:pPr>
+        <w:pStyle w:val="IntenseQuote"/>
+      </w:pPr>
+      <w:r>
+        <w:t>python run_lab.py 02</w:t>
+      </w:r>
+    </w:p>
+    <w:p>
+      <w:pPr>
+        <w:pStyle w:val="IntenseQuote"/>
+      </w:pPr>
+      <w:r>
+        <w:t>python run_lab.py 03</w:t>
+      </w:r>
+    </w:p>
+    <w:p>
+      <w:pPr>
+        <w:pStyle w:val="IntenseQuote"/>
+      </w:pPr>
+      <w:r>
+        <w:t>python run_lab.py 04</w:t>
+      </w:r>
+    </w:p>
+    <w:p>
+      <w:pPr>
+        <w:pStyle w:val="IntenseQuote"/>
+      </w:pPr>
+      <w:r>
+        <w:t>python run_lab.py 05</w:t>
+      </w:r>
+    </w:p>
+    <w:p>
+      <w:pPr>
+        <w:pStyle w:val="IntenseQuote"/>
+      </w:pPr>
+      <w:r>
+        <w:t>python run_lab.py 06</w:t>
+      </w:r>
+    </w:p>
+    <w:p>
+      <w:pPr>
+        <w:pStyle w:val="IntenseQuote"/>
+      </w:pPr>
+      <w:r>
+        <w:t>python run_lab.py 07</w:t>
+      </w:r>
+    </w:p>
+    <w:p>
+      <w:pPr>
+        <w:pStyle w:val="IntenseQuote"/>
+      </w:pPr>
+      <w:r>
+        <w:t>python run_lab.py 08</w:t>
+      </w:r>
+    </w:p>
+    <w:p>
+      <w:pPr>
+        <w:pStyle w:val="IntenseQuote"/>
+      </w:pPr>
+      <w:r>
+        <w:t>python run_lab.py 09</w:t>
+      </w:r>
+    </w:p>
+    <w:p>
+      <w:pPr>
+        <w:pStyle w:val="IntenseQuote"/>
+      </w:pPr>
+      <w:r>
+        <w:t>python run_lab.py 10</w:t>
+      </w:r>
+    </w:p>
+    <w:p>
+      <w:pPr>
+        <w:pStyle w:val="IntenseQuote"/>
+      </w:pPr>
+      <w:r>
+        <w:t>python run_lab.py 11</w:t>
+      </w:r>
+    </w:p>
+    <w:p>
+      <w:pPr>
+        <w:pStyle w:val="IntenseQuote"/>
+      </w:pPr>
+      <w:r>
+        <w:t>python run_lab.py 12</w:t>
+      </w:r>
+    </w:p>
+    <w:p>
+      <w:pPr>
+        <w:pStyle w:val="IntenseQuote"/>
+      </w:pPr>
+      <w:r>
+        <w:t>docker compose -p day7_lab up -d minio</w:t>
+      </w:r>
+    </w:p>
+    <w:p>
+      <w:pPr>
+        <w:pStyle w:val="IntenseQuote"/>
+      </w:pPr>
+      <w:r>
+        <w:t>docker compose -p day7_lab --profile object-store run --rm mc</w:t>
+      </w:r>
+    </w:p>
     <w:sectPr>
       <w:pgSz w:w="12240" w:h="15840"/>
       <w:pgMar w:top="1440" w:right="1440" w:bottom="1440" w:left="1440" w:header="708" w:footer="708" w:gutter="0"/>

</xml_diff>

<commit_message>
Add Day 7 Jupyter notebooks and update labs
Update lab code and helpers (day7_common.py, lab_05, lab_08, lab_11, lab_12), rename spark_bronze_to_silver.py to spark_silver_cleaning.py, and modify docker-compose.yml. Also update Day 07 slides and the Lab Guide docx. Notebooks mirror the existing Python lab scripts to provide sectioned, interactive walkthroughs for classroom demos and learners.
</commit_message>
<xml_diff>
--- a/Week_02/Day_07/Lab/Day_07_Lab_Guide.docx
+++ b/Week_02/Day_07/Lab/Day_07_Lab_Guide.docx
@@ -1517,6 +1517,44 @@
           <w:sz w:val="19"/>
         </w:rPr>
         <w:t>python run_lab.py 01</w:t>
+      </w:r>
+    </w:p>
+    <w:p>
+      <w:pPr>
+        <w:pStyle w:val="Heading1"/>
+      </w:pPr>
+      <w:r>
+        <w:t>Optional Jupyter Notebook Companion Track</w:t>
+      </w:r>
+    </w:p>
+    <w:p>
+      <w:r>
+        <w:t>Use the notebooks when you want a more visual walkthrough of the same Day 7 labs. They are companion materials only; they do not replace Lab_Files/labs or the run_lab.py Docker flow.</w:t>
+      </w:r>
+    </w:p>
+    <w:p>
+      <w:r>
+        <w:t>Notebook folder: Lab_Files/Jupyter_Notebooks</w:t>
+      </w:r>
+    </w:p>
+    <w:p>
+      <w:r>
+        <w:t>Start here: Lab_Files/Jupyter_Notebooks/README.md</w:t>
+      </w:r>
+    </w:p>
+    <w:p>
+      <w:r>
+        <w:t>Open from the Day 7 root folder:</w:t>
+      </w:r>
+    </w:p>
+    <w:p>
+      <w:r>
+        <w:t>jupyter lab Lab_Files/Jupyter_Notebooks</w:t>
+      </w:r>
+    </w:p>
+    <w:p>
+      <w:r>
+        <w:t>Notebook sequence: lab_01_spark_dataframe_basics.ipynb through lab_12_full_medallion_pipeline.ipynb. Labs 05 to 10 expect earlier layer outputs, while Labs 11 and 12 are self-contained orchestration walkthroughs.</w:t>
       </w:r>
     </w:p>
     <w:tbl>
@@ -3444,7 +3482,7 @@
     </w:p>
     <w:p>
       <w:r>
-        <w:t>Purpose: Use a window function to select the latest event per order_id.</w:t>
+        <w:t>Purpose: Explicitly deduplicate valid Silver events, then use a window function to select the latest event per order_id.</w:t>
       </w:r>
     </w:p>
     <w:p>
@@ -3591,6 +3629,12 @@
         </w:tc>
       </w:tr>
     </w:tbl>
+    <w:p>
+      <w:pPr/>
+      <w:r>
+        <w:t>Expected Day 7 row path: 12 Bronze, 10 valid, 9 deduplicated, 2 quarantined, 7 current.</w:t>
+      </w:r>
+    </w:p>
     <w:p>
       <w:pPr>
         <w:pStyle w:val="Heading2"/>
@@ -3930,7 +3974,7 @@
     </w:p>
     <w:p>
       <w:r>
-        <w:t>Purpose: Process source files with a manifest so already-ingested files are not processed twice.</w:t>
+        <w:t>Purpose: Process source files with a preserved manifest so reruns skip already-ingested files instead of resetting the checkpoint.</w:t>
       </w:r>
     </w:p>
     <w:p>
@@ -4684,7 +4728,7 @@
         <w:pStyle w:val="ListNumber"/>
       </w:pPr>
       <w:r>
-        <w:t>Why does Lab 08 use a window function instead of a normal group by?</w:t>
+        <w:t>Why does Lab 08 deduplicate before using a CDC window function?</w:t>
       </w:r>
     </w:p>
     <w:p>
@@ -4970,6 +5014,11 @@
       </w:pPr>
       <w:r>
         <w:t>docker compose -p day7_lab --profile object-store run --rm mc</w:t>
+      </w:r>
+    </w:p>
+    <w:p>
+      <w:r>
+        <w:t>Kafka and Zookeeper are optional Day 8 streaming services; start them only with --profile streaming.</w:t>
       </w:r>
     </w:p>
     <w:sectPr>

</xml_diff>